<commit_message>
Set author identity (Aashish Kumar Mahato), ORCID, and GitHub repo URL
</commit_message>
<xml_diff>
--- a/paper/paper.docx
+++ b/paper/paper.docx
@@ -15,7 +15,7 @@
         <w:pStyle w:val="Author"/>
       </w:pPr>
       <w:r>
-        <w:t xml:space="preserve">Aashish — Independent Researcher</w:t>
+        <w:t xml:space="preserve">Aashish Kumar Mahato — Independent Researcher</w:t>
       </w:r>
     </w:p>
     <w:p>
@@ -59,7 +59,7 @@
         <w:t xml:space="preserve"> </w:t>
       </w:r>
       <w:r>
-        <w:t xml:space="preserve">https://github.com/YOUR-USERNAME/processmind</w:t>
+        <w:t xml:space="preserve">https://github.com/aashish254/processmind</w:t>
       </w:r>
     </w:p>
     <w:bookmarkStart w:id="9" w:name="introduction"/>

</xml_diff>

<commit_message>
Add thesis preprint DOI (10.5281/zenodo.22854334) to README and paper
</commit_message>
<xml_diff>
--- a/paper/paper.docx
+++ b/paper/paper.docx
@@ -60,6 +60,24 @@
       </w:r>
       <w:r>
         <w:t xml:space="preserve">https://github.com/aashish254/processmind</w:t>
+      </w:r>
+    </w:p>
+    <w:p>
+      <w:pPr>
+        <w:pStyle w:val="BodyText"/>
+      </w:pPr>
+      <w:r>
+        <w:rPr>
+          <w:b/>
+          <w:bCs/>
+        </w:rPr>
+        <w:t xml:space="preserve">Full thesis (preprint):</w:t>
+      </w:r>
+      <w:r>
+        <w:t xml:space="preserve"> </w:t>
+      </w:r>
+      <w:r>
+        <w:t xml:space="preserve">https://doi.org/10.5281/zenodo.22854334</w:t>
       </w:r>
     </w:p>
     <w:bookmarkStart w:id="9" w:name="introduction"/>

</xml_diff>